<commit_message>
Translate submission deck to Indonesian with beginner read-aloud script
- (sub) SejutaStay_Presentation.pptx: all slide text translated to Indonesian
  (SQL code and table/attribute names kept as-is), ERD image title localized,
  speaker notes rewritten as a beginner-level read-aloud script with timing
- Naskah_Presentasi_8_Menit.docx: regenerated as the same beginner script,
  with usage guide, timing table, and Q&A cheat sheet in simple Indonesian
- README.md: updated file descriptions

https://claude.ai/code/session_01Nojww3eyVmwBt1E2v8WCr9
</commit_message>
<xml_diff>
--- a/Naskah_Presentasi_8_Menit.docx
+++ b/Naskah_Presentasi_8_Menit.docx
@@ -10,9 +10,9 @@
         <w:rPr>
           <w:b/>
           <w:color w:val="0E4A5C"/>
-          <w:sz w:val="44"/>
+          <w:sz w:val="40"/>
         </w:rPr>
-        <w:t>NASKAH PRESENTASI 8 MENIT</w:t>
+        <w:t>NASKAH PRESENTASI 8 MENIT — VERSI BAHASA PEMULA</w:t>
       </w:r>
     </w:p>
     <w:p>
@@ -22,9 +22,9 @@
       <w:r>
         <w:rPr>
           <w:i/>
-          <w:sz w:val="26"/>
+          <w:sz w:val="24"/>
         </w:rPr>
-        <w:t>SejutaStay Hotel Booking Database — Normalisasi UNF → 3NF</w:t>
+        <w:t>Tinggal dibaca di depan kelas — semua istilah sudah dijelaskan dengan bahasa sederhana</w:t>
       </w:r>
     </w:p>
     <w:p>
@@ -35,7 +35,7 @@
         <w:rPr>
           <w:sz w:val="22"/>
         </w:rPr>
-        <w:t>AOL Database Technology (COMP6799001) · Semester 4 / 2025–2026</w:t>
+        <w:t>SejutaStay — Database Pemesanan Hotel  ·  AOL Database Technology (COMP6799001)</w:t>
       </w:r>
     </w:p>
     <w:p>
@@ -58,10 +58,63 @@
       <w:r>
         <w:rPr>
           <w:b/>
-          <w:color w:val="0E4A5C"/>
-          <w:sz w:val="32"/>
+          <w:color w:val="B8860B"/>
+          <w:sz w:val="26"/>
         </w:rPr>
-        <w:t>Pembagian Presenter &amp; Alokasi Waktu (Total 8 Menit)</w:t>
+        <w:t>Cara Pakai Naskah Ini</w:t>
+      </w:r>
+    </w:p>
+    <w:p>
+      <w:pPr>
+        <w:pStyle w:val="ListBullet"/>
+      </w:pPr>
+      <w:r>
+        <w:t>Naskah ini SAMA PERSIS dengan speaker notes di file PPT — buka Presenter View di PowerPoint, naskahnya langsung terlihat di bawah setiap slide.</w:t>
+      </w:r>
+    </w:p>
+    <w:p>
+      <w:pPr>
+        <w:pStyle w:val="ListBullet"/>
+      </w:pPr>
+      <w:r>
+        <w:t>Baris pertama setiap bagian menunjukkan slide ke berapa, perkiraan durasinya, dan siapa yang membaca (Daniel / Edvardo).</w:t>
+      </w:r>
+    </w:p>
+    <w:p>
+      <w:pPr>
+        <w:pStyle w:val="ListBullet"/>
+      </w:pPr>
+      <w:r>
+        <w:t>Total durasi kalau dibaca dengan tempo santai: kurang lebih 7 menit 30 detik — masih ada sisa waktu aman dari batas 8 menit.</w:t>
+      </w:r>
+    </w:p>
+    <w:p>
+      <w:pPr>
+        <w:pStyle w:val="ListBullet"/>
+      </w:pPr>
+      <w:r>
+        <w:t>Latihan membaca minimal 2 kali dengan timer, supaya saat tampil tidak terburu-buru.</w:t>
+      </w:r>
+    </w:p>
+    <w:p>
+      <w:pPr>
+        <w:pStyle w:val="ListBullet"/>
+      </w:pPr>
+      <w:r>
+        <w:t>Kalimat dalam huruf KAPITAL adalah kata yang perlu sedikit ditekankan saat dibaca.</w:t>
+      </w:r>
+    </w:p>
+    <w:p>
+      <w:pPr>
+        <w:spacing w:before="280"/>
+      </w:pPr>
+      <w:r>
+        <w:rPr>
+          <w:b/>
+          <w:color w:val="B8860B"/>
+          <w:sz w:val="26"/>
+        </w:rPr>
+        <w:t>Pembagian Waktu Singkat</w:t>
       </w:r>
     </w:p>
     <w:tbl>
@@ -71,15 +124,27 @@
         <w:tblLook w:firstColumn="1" w:firstRow="1" w:lastColumn="0" w:lastRow="0" w:noHBand="0" w:noVBand="1" w:val="04A0"/>
       </w:tblPr>
       <w:tblGrid>
-        <w:gridCol w:w="2160"/>
-        <w:gridCol w:w="2160"/>
-        <w:gridCol w:w="2160"/>
-        <w:gridCol w:w="2160"/>
+        <w:gridCol w:w="2880"/>
+        <w:gridCol w:w="2880"/>
+        <w:gridCol w:w="2880"/>
       </w:tblGrid>
       <w:tr>
         <w:tc>
           <w:tcPr>
-            <w:tcW w:type="dxa" w:w="2160"/>
+            <w:tcW w:type="dxa" w:w="2880"/>
+          </w:tcPr>
+          <w:p>
+            <w:r>
+              <w:rPr>
+                <w:b/>
+              </w:rPr>
+              <w:t>Bagian</w:t>
+            </w:r>
+          </w:p>
+        </w:tc>
+        <w:tc>
+          <w:tcPr>
+            <w:tcW w:type="dxa" w:w="2880"/>
           </w:tcPr>
           <w:p>
             <w:r>
@@ -92,40 +157,14 @@
         </w:tc>
         <w:tc>
           <w:tcPr>
-            <w:tcW w:type="dxa" w:w="2160"/>
+            <w:tcW w:type="dxa" w:w="2880"/>
           </w:tcPr>
           <w:p>
             <w:r>
               <w:rPr>
                 <w:b/>
               </w:rPr>
-              <w:t>Waktu</w:t>
-            </w:r>
-          </w:p>
-        </w:tc>
-        <w:tc>
-          <w:tcPr>
-            <w:tcW w:type="dxa" w:w="2160"/>
-          </w:tcPr>
-          <w:p>
-            <w:r>
-              <w:rPr>
-                <w:b/>
-              </w:rPr>
-              <w:t>Presenter</w:t>
-            </w:r>
-          </w:p>
-        </w:tc>
-        <w:tc>
-          <w:tcPr>
-            <w:tcW w:type="dxa" w:w="2160"/>
-          </w:tcPr>
-          <w:p>
-            <w:r>
-              <w:rPr>
-                <w:b/>
-              </w:rPr>
-              <w:t>Topik</w:t>
+              <w:t>Pembaca</w:t>
             </w:r>
           </w:p>
         </w:tc>
@@ -133,27 +172,27 @@
       <w:tr>
         <w:tc>
           <w:tcPr>
-            <w:tcW w:type="dxa" w:w="2160"/>
+            <w:tcW w:type="dxa" w:w="2880"/>
           </w:tcPr>
           <w:p>
             <w:r>
-              <w:t>1</w:t>
+              <w:t>Pembukaan &amp; agenda (±1 menit)</w:t>
             </w:r>
           </w:p>
         </w:tc>
         <w:tc>
           <w:tcPr>
-            <w:tcW w:type="dxa" w:w="2160"/>
+            <w:tcW w:type="dxa" w:w="2880"/>
           </w:tcPr>
           <w:p>
             <w:r>
-              <w:t>0:00–0:30</w:t>
+              <w:t>1–2</w:t>
             </w:r>
           </w:p>
         </w:tc>
         <w:tc>
           <w:tcPr>
-            <w:tcW w:type="dxa" w:w="2160"/>
+            <w:tcW w:type="dxa" w:w="2880"/>
           </w:tcPr>
           <w:p>
             <w:r>
@@ -161,13 +200,35 @@
             </w:r>
           </w:p>
         </w:tc>
+      </w:tr>
+      <w:tr>
         <w:tc>
           <w:tcPr>
-            <w:tcW w:type="dxa" w:w="2160"/>
+            <w:tcW w:type="dxa" w:w="2880"/>
           </w:tcPr>
           <w:p>
             <w:r>
-              <w:t>Pembukaan &amp; perkenalan kelompok</w:t>
+              <w:t>Masalah, data sampel, anomali (±2,5 menit)</w:t>
+            </w:r>
+          </w:p>
+        </w:tc>
+        <w:tc>
+          <w:tcPr>
+            <w:tcW w:type="dxa" w:w="2880"/>
+          </w:tcPr>
+          <w:p>
+            <w:r>
+              <w:t>3–5</w:t>
+            </w:r>
+          </w:p>
+        </w:tc>
+        <w:tc>
+          <w:tcPr>
+            <w:tcW w:type="dxa" w:w="2880"/>
+          </w:tcPr>
+          <w:p>
+            <w:r>
+              <w:t>Daniel</w:t>
             </w:r>
           </w:p>
         </w:tc>
@@ -175,41 +236,31 @@
       <w:tr>
         <w:tc>
           <w:tcPr>
-            <w:tcW w:type="dxa" w:w="2160"/>
+            <w:tcW w:type="dxa" w:w="2880"/>
           </w:tcPr>
           <w:p>
             <w:r>
-              <w:t>2</w:t>
+              <w:t>Normalisasi 1NF–2NF–3NF (±2,5 menit)</w:t>
             </w:r>
           </w:p>
         </w:tc>
         <w:tc>
           <w:tcPr>
-            <w:tcW w:type="dxa" w:w="2160"/>
+            <w:tcW w:type="dxa" w:w="2880"/>
           </w:tcPr>
           <w:p>
             <w:r>
-              <w:t>0:30–1:00</w:t>
+              <w:t>6–9</w:t>
             </w:r>
           </w:p>
         </w:tc>
         <w:tc>
           <w:tcPr>
-            <w:tcW w:type="dxa" w:w="2160"/>
+            <w:tcW w:type="dxa" w:w="2880"/>
           </w:tcPr>
           <w:p>
             <w:r>
-              <w:t>Daniel</w:t>
-            </w:r>
-          </w:p>
-        </w:tc>
-        <w:tc>
-          <w:tcPr>
-            <w:tcW w:type="dxa" w:w="2160"/>
-          </w:tcPr>
-          <w:p>
-            <w:r>
-              <w:t>Agenda presentasi</w:t>
+              <w:t>Edvardo</w:t>
             </w:r>
           </w:p>
         </w:tc>
@@ -217,301 +268,17 @@
       <w:tr>
         <w:tc>
           <w:tcPr>
-            <w:tcW w:type="dxa" w:w="2160"/>
+            <w:tcW w:type="dxa" w:w="2880"/>
           </w:tcPr>
           <w:p>
             <w:r>
-              <w:t>3</w:t>
+              <w:t>ERD hasil akhir (±40 detik)</w:t>
             </w:r>
           </w:p>
         </w:tc>
         <w:tc>
           <w:tcPr>
-            <w:tcW w:type="dxa" w:w="2160"/>
-          </w:tcPr>
-          <w:p>
-            <w:r>
-              <w:t>1:00–2:00</w:t>
-            </w:r>
-          </w:p>
-        </w:tc>
-        <w:tc>
-          <w:tcPr>
-            <w:tcW w:type="dxa" w:w="2160"/>
-          </w:tcPr>
-          <w:p>
-            <w:r>
-              <w:t>Daniel</w:t>
-            </w:r>
-          </w:p>
-        </w:tc>
-        <w:tc>
-          <w:tcPr>
-            <w:tcW w:type="dxa" w:w="2160"/>
-          </w:tcPr>
-          <w:p>
-            <w:r>
-              <w:t>Bab 1 — Kasus &amp; 5 masalah performa</w:t>
-            </w:r>
-          </w:p>
-        </w:tc>
-      </w:tr>
-      <w:tr>
-        <w:tc>
-          <w:tcPr>
-            <w:tcW w:type="dxa" w:w="2160"/>
-          </w:tcPr>
-          <w:p>
-            <w:r>
-              <w:t>4</w:t>
-            </w:r>
-          </w:p>
-        </w:tc>
-        <w:tc>
-          <w:tcPr>
-            <w:tcW w:type="dxa" w:w="2160"/>
-          </w:tcPr>
-          <w:p>
-            <w:r>
-              <w:t>2:00–2:45</w:t>
-            </w:r>
-          </w:p>
-        </w:tc>
-        <w:tc>
-          <w:tcPr>
-            <w:tcW w:type="dxa" w:w="2160"/>
-          </w:tcPr>
-          <w:p>
-            <w:r>
-              <w:t>Daniel</w:t>
-            </w:r>
-          </w:p>
-        </w:tc>
-        <w:tc>
-          <w:tcPr>
-            <w:tcW w:type="dxa" w:w="2160"/>
-          </w:tcPr>
-          <w:p>
-            <w:r>
-              <w:t>Bab 2 — Data sampel UNF</w:t>
-            </w:r>
-          </w:p>
-        </w:tc>
-      </w:tr>
-      <w:tr>
-        <w:tc>
-          <w:tcPr>
-            <w:tcW w:type="dxa" w:w="2160"/>
-          </w:tcPr>
-          <w:p>
-            <w:r>
-              <w:t>5</w:t>
-            </w:r>
-          </w:p>
-        </w:tc>
-        <w:tc>
-          <w:tcPr>
-            <w:tcW w:type="dxa" w:w="2160"/>
-          </w:tcPr>
-          <w:p>
-            <w:r>
-              <w:t>2:45–3:30</w:t>
-            </w:r>
-          </w:p>
-        </w:tc>
-        <w:tc>
-          <w:tcPr>
-            <w:tcW w:type="dxa" w:w="2160"/>
-          </w:tcPr>
-          <w:p>
-            <w:r>
-              <w:t>Daniel</w:t>
-            </w:r>
-          </w:p>
-        </w:tc>
-        <w:tc>
-          <w:tcPr>
-            <w:tcW w:type="dxa" w:w="2160"/>
-          </w:tcPr>
-          <w:p>
-            <w:r>
-              <w:t>Bab 3 — Anomali &amp; functional dependency</w:t>
-            </w:r>
-          </w:p>
-        </w:tc>
-      </w:tr>
-      <w:tr>
-        <w:tc>
-          <w:tcPr>
-            <w:tcW w:type="dxa" w:w="2160"/>
-          </w:tcPr>
-          <w:p>
-            <w:r>
-              <w:t>6</w:t>
-            </w:r>
-          </w:p>
-        </w:tc>
-        <w:tc>
-          <w:tcPr>
-            <w:tcW w:type="dxa" w:w="2160"/>
-          </w:tcPr>
-          <w:p>
-            <w:r>
-              <w:t>3:30–4:00</w:t>
-            </w:r>
-          </w:p>
-        </w:tc>
-        <w:tc>
-          <w:tcPr>
-            <w:tcW w:type="dxa" w:w="2160"/>
-          </w:tcPr>
-          <w:p>
-            <w:r>
-              <w:t>Edvardo</w:t>
-            </w:r>
-          </w:p>
-        </w:tc>
-        <w:tc>
-          <w:tcPr>
-            <w:tcW w:type="dxa" w:w="2160"/>
-          </w:tcPr>
-          <w:p>
-            <w:r>
-              <w:t>Bab 4 — Peta normalisasi UNF→3NF</w:t>
-            </w:r>
-          </w:p>
-        </w:tc>
-      </w:tr>
-      <w:tr>
-        <w:tc>
-          <w:tcPr>
-            <w:tcW w:type="dxa" w:w="2160"/>
-          </w:tcPr>
-          <w:p>
-            <w:r>
-              <w:t>7</w:t>
-            </w:r>
-          </w:p>
-        </w:tc>
-        <w:tc>
-          <w:tcPr>
-            <w:tcW w:type="dxa" w:w="2160"/>
-          </w:tcPr>
-          <w:p>
-            <w:r>
-              <w:t>4:00–4:40</w:t>
-            </w:r>
-          </w:p>
-        </w:tc>
-        <w:tc>
-          <w:tcPr>
-            <w:tcW w:type="dxa" w:w="2160"/>
-          </w:tcPr>
-          <w:p>
-            <w:r>
-              <w:t>Edvardo</w:t>
-            </w:r>
-          </w:p>
-        </w:tc>
-        <w:tc>
-          <w:tcPr>
-            <w:tcW w:type="dxa" w:w="2160"/>
-          </w:tcPr>
-          <w:p>
-            <w:r>
-              <w:t>Langkah 1NF (repeating group)</w:t>
-            </w:r>
-          </w:p>
-        </w:tc>
-      </w:tr>
-      <w:tr>
-        <w:tc>
-          <w:tcPr>
-            <w:tcW w:type="dxa" w:w="2160"/>
-          </w:tcPr>
-          <w:p>
-            <w:r>
-              <w:t>8</w:t>
-            </w:r>
-          </w:p>
-        </w:tc>
-        <w:tc>
-          <w:tcPr>
-            <w:tcW w:type="dxa" w:w="2160"/>
-          </w:tcPr>
-          <w:p>
-            <w:r>
-              <w:t>4:40–5:20</w:t>
-            </w:r>
-          </w:p>
-        </w:tc>
-        <w:tc>
-          <w:tcPr>
-            <w:tcW w:type="dxa" w:w="2160"/>
-          </w:tcPr>
-          <w:p>
-            <w:r>
-              <w:t>Edvardo</w:t>
-            </w:r>
-          </w:p>
-        </w:tc>
-        <w:tc>
-          <w:tcPr>
-            <w:tcW w:type="dxa" w:w="2160"/>
-          </w:tcPr>
-          <w:p>
-            <w:r>
-              <w:t>Langkah 2NF (partial dependency)</w:t>
-            </w:r>
-          </w:p>
-        </w:tc>
-      </w:tr>
-      <w:tr>
-        <w:tc>
-          <w:tcPr>
-            <w:tcW w:type="dxa" w:w="2160"/>
-          </w:tcPr>
-          <w:p>
-            <w:r>
-              <w:t>9</w:t>
-            </w:r>
-          </w:p>
-        </w:tc>
-        <w:tc>
-          <w:tcPr>
-            <w:tcW w:type="dxa" w:w="2160"/>
-          </w:tcPr>
-          <w:p>
-            <w:r>
-              <w:t>5:20–5:50</w:t>
-            </w:r>
-          </w:p>
-        </w:tc>
-        <w:tc>
-          <w:tcPr>
-            <w:tcW w:type="dxa" w:w="2160"/>
-          </w:tcPr>
-          <w:p>
-            <w:r>
-              <w:t>Edvardo</w:t>
-            </w:r>
-          </w:p>
-        </w:tc>
-        <w:tc>
-          <w:tcPr>
-            <w:tcW w:type="dxa" w:w="2160"/>
-          </w:tcPr>
-          <w:p>
-            <w:r>
-              <w:t>Langkah 3NF (transitive dependency)</w:t>
-            </w:r>
-          </w:p>
-        </w:tc>
-      </w:tr>
-      <w:tr>
-        <w:tc>
-          <w:tcPr>
-            <w:tcW w:type="dxa" w:w="2160"/>
+            <w:tcW w:type="dxa" w:w="2880"/>
           </w:tcPr>
           <w:p>
             <w:r>
@@ -521,17 +288,7 @@
         </w:tc>
         <w:tc>
           <w:tcPr>
-            <w:tcW w:type="dxa" w:w="2160"/>
-          </w:tcPr>
-          <w:p>
-            <w:r>
-              <w:t>5:50–6:30</w:t>
-            </w:r>
-          </w:p>
-        </w:tc>
-        <w:tc>
-          <w:tcPr>
-            <w:tcW w:type="dxa" w:w="2160"/>
+            <w:tcW w:type="dxa" w:w="2880"/>
           </w:tcPr>
           <w:p>
             <w:r>
@@ -539,13 +296,35 @@
             </w:r>
           </w:p>
         </w:tc>
+      </w:tr>
+      <w:tr>
         <w:tc>
           <w:tcPr>
-            <w:tcW w:type="dxa" w:w="2160"/>
+            <w:tcW w:type="dxa" w:w="2880"/>
           </w:tcPr>
           <w:p>
             <w:r>
-              <w:t>Bab 5 — ERD final (Crow's Foot)</w:t>
+              <w:t>Manfaat &amp; rangkuman (±40 detik)</w:t>
+            </w:r>
+          </w:p>
+        </w:tc>
+        <w:tc>
+          <w:tcPr>
+            <w:tcW w:type="dxa" w:w="2880"/>
+          </w:tcPr>
+          <w:p>
+            <w:r>
+              <w:t>11–12</w:t>
+            </w:r>
+          </w:p>
+        </w:tc>
+        <w:tc>
+          <w:tcPr>
+            <w:tcW w:type="dxa" w:w="2880"/>
+          </w:tcPr>
+          <w:p>
+            <w:r>
+              <w:t>Daniel</w:t>
             </w:r>
           </w:p>
         </w:tc>
@@ -553,41 +332,31 @@
       <w:tr>
         <w:tc>
           <w:tcPr>
-            <w:tcW w:type="dxa" w:w="2160"/>
+            <w:tcW w:type="dxa" w:w="2880"/>
           </w:tcPr>
           <w:p>
             <w:r>
-              <w:t>11</w:t>
+              <w:t>Bukti MySQL &amp; kesimpulan (±45 detik)</w:t>
             </w:r>
           </w:p>
         </w:tc>
         <w:tc>
           <w:tcPr>
-            <w:tcW w:type="dxa" w:w="2160"/>
+            <w:tcW w:type="dxa" w:w="2880"/>
           </w:tcPr>
           <w:p>
             <w:r>
-              <w:t>6:30–6:50</w:t>
+              <w:t>13–14</w:t>
             </w:r>
           </w:p>
         </w:tc>
         <w:tc>
           <w:tcPr>
-            <w:tcW w:type="dxa" w:w="2160"/>
+            <w:tcW w:type="dxa" w:w="2880"/>
           </w:tcPr>
           <w:p>
             <w:r>
-              <w:t>Daniel</w:t>
-            </w:r>
-          </w:p>
-        </w:tc>
-        <w:tc>
-          <w:tcPr>
-            <w:tcW w:type="dxa" w:w="2160"/>
-          </w:tcPr>
-          <w:p>
-            <w:r>
-              <w:t>Dampak bisnis</w:t>
+              <w:t>Edvardo</w:t>
             </w:r>
           </w:p>
         </w:tc>
@@ -595,133 +364,17 @@
       <w:tr>
         <w:tc>
           <w:tcPr>
-            <w:tcW w:type="dxa" w:w="2160"/>
+            <w:tcW w:type="dxa" w:w="2880"/>
           </w:tcPr>
           <w:p>
             <w:r>
-              <w:t>12</w:t>
+              <w:t>Penutup (±10 detik)</w:t>
             </w:r>
           </w:p>
         </w:tc>
         <w:tc>
           <w:tcPr>
-            <w:tcW w:type="dxa" w:w="2160"/>
-          </w:tcPr>
-          <w:p>
-            <w:r>
-              <w:t>6:50–7:10</w:t>
-            </w:r>
-          </w:p>
-        </w:tc>
-        <w:tc>
-          <w:tcPr>
-            <w:tcW w:type="dxa" w:w="2160"/>
-          </w:tcPr>
-          <w:p>
-            <w:r>
-              <w:t>Daniel</w:t>
-            </w:r>
-          </w:p>
-        </w:tc>
-        <w:tc>
-          <w:tcPr>
-            <w:tcW w:type="dxa" w:w="2160"/>
-          </w:tcPr>
-          <w:p>
-            <w:r>
-              <w:t>Rangkuman Before vs After</w:t>
-            </w:r>
-          </w:p>
-        </w:tc>
-      </w:tr>
-      <w:tr>
-        <w:tc>
-          <w:tcPr>
-            <w:tcW w:type="dxa" w:w="2160"/>
-          </w:tcPr>
-          <w:p>
-            <w:r>
-              <w:t>13</w:t>
-            </w:r>
-          </w:p>
-        </w:tc>
-        <w:tc>
-          <w:tcPr>
-            <w:tcW w:type="dxa" w:w="2160"/>
-          </w:tcPr>
-          <w:p>
-            <w:r>
-              <w:t>7:10–7:35</w:t>
-            </w:r>
-          </w:p>
-        </w:tc>
-        <w:tc>
-          <w:tcPr>
-            <w:tcW w:type="dxa" w:w="2160"/>
-          </w:tcPr>
-          <w:p>
-            <w:r>
-              <w:t>Edvardo</w:t>
-            </w:r>
-          </w:p>
-        </w:tc>
-        <w:tc>
-          <w:tcPr>
-            <w:tcW w:type="dxa" w:w="2160"/>
-          </w:tcPr>
-          <w:p>
-            <w:r>
-              <w:t>Bukti implementasi MySQL</w:t>
-            </w:r>
-          </w:p>
-        </w:tc>
-      </w:tr>
-      <w:tr>
-        <w:tc>
-          <w:tcPr>
-            <w:tcW w:type="dxa" w:w="2160"/>
-          </w:tcPr>
-          <w:p>
-            <w:r>
-              <w:t>14</w:t>
-            </w:r>
-          </w:p>
-        </w:tc>
-        <w:tc>
-          <w:tcPr>
-            <w:tcW w:type="dxa" w:w="2160"/>
-          </w:tcPr>
-          <w:p>
-            <w:r>
-              <w:t>7:35–7:55</w:t>
-            </w:r>
-          </w:p>
-        </w:tc>
-        <w:tc>
-          <w:tcPr>
-            <w:tcW w:type="dxa" w:w="2160"/>
-          </w:tcPr>
-          <w:p>
-            <w:r>
-              <w:t>Edvardo</w:t>
-            </w:r>
-          </w:p>
-        </w:tc>
-        <w:tc>
-          <w:tcPr>
-            <w:tcW w:type="dxa" w:w="2160"/>
-          </w:tcPr>
-          <w:p>
-            <w:r>
-              <w:t>Hasil akhir &amp; kesimpulan</w:t>
-            </w:r>
-          </w:p>
-        </w:tc>
-      </w:tr>
-      <w:tr>
-        <w:tc>
-          <w:tcPr>
-            <w:tcW w:type="dxa" w:w="2160"/>
+            <w:tcW w:type="dxa" w:w="2880"/>
           </w:tcPr>
           <w:p>
             <w:r>
@@ -731,31 +384,11 @@
         </w:tc>
         <w:tc>
           <w:tcPr>
-            <w:tcW w:type="dxa" w:w="2160"/>
-          </w:tcPr>
-          <w:p>
-            <w:r>
-              <w:t>7:55–8:00</w:t>
-            </w:r>
-          </w:p>
-        </w:tc>
-        <w:tc>
-          <w:tcPr>
-            <w:tcW w:type="dxa" w:w="2160"/>
+            <w:tcW w:type="dxa" w:w="2880"/>
           </w:tcPr>
           <w:p>
             <w:r>
               <w:t>Berdua</w:t>
-            </w:r>
-          </w:p>
-        </w:tc>
-        <w:tc>
-          <w:tcPr>
-            <w:tcW w:type="dxa" w:w="2160"/>
-          </w:tcPr>
-          <w:p>
-            <w:r>
-              <w:t>Penutup &amp; Q&amp;A</w:t>
             </w:r>
           </w:p>
         </w:tc>
@@ -769,18 +402,9 @@
         <w:rPr>
           <w:b/>
           <w:color w:val="0E4A5C"/>
-          <w:sz w:val="32"/>
+          <w:sz w:val="30"/>
         </w:rPr>
-        <w:t>Naskah Lengkap Per Slide</w:t>
-      </w:r>
-    </w:p>
-    <w:p>
-      <w:r>
-        <w:rPr>
-          <w:b w:val="0"/>
-          <w:i/>
-        </w:rPr>
-        <w:t>Naskah di bawah ini juga sudah tertanam sebagai speaker notes di file PPT pengumpulan, sehingga bisa dibaca langsung dari Presenter View saat presentasi.</w:t>
+        <w:t>Naskah Lengkap — Tinggal Dibaca</w:t>
       </w:r>
     </w:p>
     <w:p>
@@ -791,9 +415,9 @@
         <w:rPr>
           <w:b/>
           <w:color w:val="B8860B"/>
-          <w:sz w:val="26"/>
+          <w:sz w:val="24"/>
         </w:rPr>
-        <w:t>Slide 1 — Pembukaan</w:t>
+        <w:t>SLIDE 1 - PEMBUKAAN | sekitar 30 detik | DANIEL</w:t>
       </w:r>
     </w:p>
     <w:p>
@@ -802,7 +426,7 @@
           <w:b w:val="0"/>
           <w:i w:val="0"/>
         </w:rPr>
-        <w:t>[0:00-0:30 | DANIEL] PEMBUKAAN</w:t>
+        <w:t>Selamat pagi Bapak/Ibu dosen dan teman-teman semua. Perkenalkan, kami dari kelompok SejutaStay. Saya Daniel Steffen Kurniawan, dan ini rekan saya, Edvardo Khong.</w:t>
       </w:r>
     </w:p>
     <w:p>
@@ -811,7 +435,7 @@
           <w:b w:val="0"/>
           <w:i w:val="0"/>
         </w:rPr>
-        <w:t>"Selamat pagi/siang Bapak/Ibu dan teman-teman. Kami dari kelompok SejutaStay: saya Daniel Steffen Kurniawan (2602071171) dan rekan saya Edvardo Khong (2602177171). Hari ini kami mempresentasikan proyek AOL Database Technology: perancangan dan normalisasi database pemesanan hotel SejutaStay, dari bentuk tidak normal (UNF) sampai 3NF, untuk sektor Tourism &amp; Hospitality."</w:t>
+        <w:t>Hari ini kami akan mempresentasikan proyek mata kuliah Database Technology. Sederhananya, database itu adalah tempat untuk menyimpan data di komputer secara rapi dan teratur. Dalam proyek ini, kami membuat database untuk pemesanan hotel, dengan nama perusahaan fiktif "SejutaStay". Kasus ini termasuk dalam sektor pariwisata dan perhotelan, sesuai pilihan yang diberikan di soal.</w:t>
       </w:r>
     </w:p>
     <w:p>
@@ -820,7 +444,7 @@
           <w:b w:val="0"/>
           <w:i w:val="0"/>
         </w:rPr>
-        <w:t>POIN PENTING: sebutkan nama, NIM, judul, dan sektor industri (Tourism &amp; Hospitality) - ini salah satu syarat soal.</w:t>
+        <w:t>Inti proyek kami: kami mengambil data hotel yang awalnya berantakan, lalu kami rapikan tahap demi tahap dengan teknik yang namanya "normalisasi", sampai menjadi database yang baik dan benar.</w:t>
       </w:r>
     </w:p>
     <w:p>
@@ -831,9 +455,9 @@
         <w:rPr>
           <w:b/>
           <w:color w:val="B8860B"/>
-          <w:sz w:val="26"/>
+          <w:sz w:val="24"/>
         </w:rPr>
-        <w:t>Slide 2 — Agenda</w:t>
+        <w:t>SLIDE 2 - AGENDA | sekitar 30 detik | DANIEL</w:t>
       </w:r>
     </w:p>
     <w:p>
@@ -842,7 +466,7 @@
           <w:b w:val="0"/>
           <w:i w:val="0"/>
         </w:rPr>
-        <w:t>[0:30-1:00 | DANIEL] AGENDA</w:t>
+        <w:t>Sebelum masuk ke isi, ini alur presentasi kami. Ada enam bagian.</w:t>
       </w:r>
     </w:p>
     <w:p>
@@ -851,7 +475,7 @@
           <w:b w:val="0"/>
           <w:i w:val="0"/>
         </w:rPr>
-        <w:t>"Alur presentasi kami ada 6 tahap: (1) masalah pada data saat ini, (2) data sampel dalam bentuk un-normal, (3) anomali dan functional dependency, (4) proses normalisasi 1NF-2NF-3NF, (5) ERD hasil akhir, dan (6) bukti implementasi di MySQL. Singkatnya: kami mulai dari satu tabel yang berantakan dan berakhir dengan database 3NF yang sudah teruji."</w:t>
+        <w:t>Pertama, kami ceritakan dulu MASALAHNYA - apa yang salah dengan cara hotel menyimpan data sekarang. Kedua, kami tunjukkan DATA CONTOHNYA yang masih berantakan. Ketiga, kami tunjukkan ANOMALI, yaitu masalah-masalah aneh yang muncul karena data berantakan itu. Keempat, kami rapikan datanya lewat tiga tahap NORMALISASI. Kelima, kami gambarkan hasil akhirnya dalam bentuk diagram yang disebut ERD. Dan keenam, kami buktikan bahwa semuanya benar-benar jalan di program MySQL.</w:t>
       </w:r>
     </w:p>
     <w:p>
@@ -860,7 +484,7 @@
           <w:b w:val="0"/>
           <w:i w:val="0"/>
         </w:rPr>
-        <w:t>TIPS: cukup 2 kalimat, jangan berlama-lama di slide ini.</w:t>
+        <w:t>Jadi singkatnya: kami mulai dari satu tabel yang berantakan, dan berakhir dengan database yang rapi dan sudah teruji.</w:t>
       </w:r>
     </w:p>
     <w:p>
@@ -871,9 +495,9 @@
         <w:rPr>
           <w:b/>
           <w:color w:val="B8860B"/>
-          <w:sz w:val="26"/>
+          <w:sz w:val="24"/>
         </w:rPr>
-        <w:t>Slide 3 — Bab 1: Masalah</w:t>
+        <w:t>SLIDE 3 - BAB 1: MASALAH | sekitar 1 menit | DANIEL</w:t>
       </w:r>
     </w:p>
     <w:p>
@@ -882,7 +506,7 @@
           <w:b w:val="0"/>
           <w:i w:val="0"/>
         </w:rPr>
-        <w:t>[1:00-2:00 | DANIEL] BAB 1 - MASALAH</w:t>
+        <w:t>Kita mulai dari ceritanya dulu. SejutaStay adalah jaringan hotel yang sedang berkembang. Cabangnya ada di Jakarta, Bali, Yogyakarta, Bandung, dan Lombok.</w:t>
       </w:r>
     </w:p>
     <w:p>
@@ -891,7 +515,7 @@
           <w:b w:val="0"/>
           <w:i w:val="0"/>
         </w:rPr>
-        <w:t>"SejutaStay adalah jaringan hotel dengan cabang di Jakarta, Bali, Yogyakarta, Bandung, dan Lombok. Saat ini SEMUA reservasi dicatat di SATU spreadsheet bernama BookingRecord - 18 kolom berisi data tamu, hotel, kamar, dan layanan yang tercampur."</w:t>
+        <w:t>Masalahnya begini: setiap kali ada tamu yang memesan kamar, petugas hotel mencatat SEMUANYA di satu file spreadsheet - mirip Excel - yang diberi nama "BookingRecord". Satu baris berisi campuran semua data: nama tamu, nomor teleponnya, nama hotelnya, nomor kamarnya, sampai layanan tambahannya. Totalnya ada 18 kolom.</w:t>
       </w:r>
     </w:p>
     <w:p>
@@ -900,7 +524,7 @@
           <w:b w:val="0"/>
           <w:i w:val="0"/>
         </w:rPr>
-        <w:t>Lima masalah performa yang kami temukan:</w:t>
+        <w:t>Waktu hotelnya masih kecil, cara ini tidak masalah. Tapi begitu pemesanannya makin banyak, muncul lima masalah:</w:t>
       </w:r>
     </w:p>
     <w:p>
@@ -909,7 +533,7 @@
           <w:b w:val="0"/>
           <w:i w:val="0"/>
         </w:rPr>
-        <w:t>1. REDUNDANSI DATA - data tamu &amp; hotel ditulis ulang di setiap baris booking.</w:t>
+        <w:t>Satu, REDUNDANSI DATA. Artinya data yang sama ditulis berulang-ulang. Setiap kali tamu yang sama memesan lagi, nama dan nomor teleponnya ditulis ulang. Ini membuang tempat penyimpanan.</w:t>
       </w:r>
     </w:p>
     <w:p>
@@ -918,7 +542,7 @@
           <w:b w:val="0"/>
           <w:i w:val="0"/>
         </w:rPr>
-        <w:t>2. UPDATE ANOMALY - satu perubahan harus diedit di banyak baris, mudah terlewat.</w:t>
+        <w:t>Dua, ANOMALI UPDATE. Kalau tamu ganti nomor telepon, kita harus mengedit SEMUA baris yang memuat namanya. Kalau ada satu baris yang terlewat, datanya jadi tidak cocok satu sama lain.</w:t>
       </w:r>
     </w:p>
     <w:p>
@@ -927,7 +551,7 @@
           <w:b w:val="0"/>
           <w:i w:val="0"/>
         </w:rPr>
-        <w:t>3. INSERTION ANOMALY - hotel/layanan baru tidak bisa ditambah tanpa ada booking.</w:t>
+        <w:t>Tiga, ANOMALI INSERT. Hotel cabang baru tidak bisa dicatat ke dalam sistem sebelum ada tamu yang memesan di sana. Padahal hotelnya sudah ada.</w:t>
       </w:r>
     </w:p>
     <w:p>
@@ -936,7 +560,7 @@
           <w:b w:val="0"/>
           <w:i w:val="0"/>
         </w:rPr>
-        <w:t>4. DELETION ANOMALY - menghapus booking bisa ikut menghapus satu-satunya data lain.</w:t>
+        <w:t>Empat, ANOMALI DELETE. Kalau kita menghapus satu pemesanan, data lain bisa ikut hilang. Misalnya, data sebuah hotel bisa hilang total hanya karena satu-satunya booking di hotel itu dihapus.</w:t>
       </w:r>
     </w:p>
     <w:p>
@@ -945,7 +569,7 @@
           <w:b w:val="0"/>
           <w:i w:val="0"/>
         </w:rPr>
-        <w:t>5. LAMBAT &amp; TIDAK ANDAL - sulit dicari, sulit dibuat laporan, tidak ada pengecekan integritas.</w:t>
+        <w:t>Dan lima, datanya jadi LAMBAT DAN TIDAK BISA DIANDALKAN. Mencari data susah, membuat laporan susah, dan tidak ada yang mencegah data salah masuk ke tabel.</w:t>
       </w:r>
     </w:p>
     <w:p>
@@ -954,7 +578,7 @@
           <w:b w:val="0"/>
           <w:i w:val="0"/>
         </w:rPr>
-        <w:t>Solusi yang kami usulkan: merancang ulang menjadi database relasional yang dinormalisasi sampai 3NF.</w:t>
+        <w:t>Solusi yang kami usulkan: merancang ulang data ini menjadi database yang rapi, dengan teknik normalisasi sampai tahap yang disebut 3NF.</w:t>
       </w:r>
     </w:p>
     <w:p>
@@ -965,9 +589,9 @@
         <w:rPr>
           <w:b/>
           <w:color w:val="B8860B"/>
-          <w:sz w:val="26"/>
+          <w:sz w:val="24"/>
         </w:rPr>
-        <w:t>Slide 4 — Bab 2: Data Sampel (UNF)</w:t>
+        <w:t>SLIDE 4 - BAB 2: DATA SAMPEL | sekitar 45 detik | DANIEL</w:t>
       </w:r>
     </w:p>
     <w:p>
@@ -976,7 +600,7 @@
           <w:b w:val="0"/>
           <w:i w:val="0"/>
         </w:rPr>
-        <w:t>[2:00-2:45 | DANIEL] BAB 2 - DATA SAMPEL (UNF)</w:t>
+        <w:t>Sekarang kita lihat datanya. Kami memakai 7 contoh pemesanan dengan 18 kolom. Bentuk datanya kami contoh dari data reservasi hotel sungguhan yang dipublikasikan peneliti pada tahun 2019. Kami sengaja pakai data yang sedikit, supaya setiap langkah perapian bisa diikuti dengan mudah.</w:t>
       </w:r>
     </w:p>
     <w:p>
@@ -985,7 +609,7 @@
           <w:b w:val="0"/>
           <w:i w:val="0"/>
         </w:rPr>
-        <w:t>"Data sampel kami: 7 reservasi dengan 18 atribut, dimodelkan dari data reservasi hotel nyata (dataset Hotel Booking Demand, Antonio dkk., 2019)."</w:t>
+        <w:t>Data seperti ini disebut "UN-NORMALIZED" atau belum normal. Kenapa? Coba lihat tabel di sebelah kanan, di baris B002. Tamu bernama Bella Sari memesan DUA kamar sekaligus, yaitu kamar 201 dan 202. Dua nomor kamar itu ditulis di dalam SATU kotak, dipisah titik koma.</w:t>
       </w:r>
     </w:p>
     <w:p>
@@ -994,16 +618,7 @@
           <w:b w:val="0"/>
           <w:i w:val="0"/>
         </w:rPr>
-        <w:t>"Mengapa disebut un-normalized? Karena ada REPEATING GROUP - satu booking bisa punya beberapa kamar atau layanan, sehingga banyak nilai dijejalkan dalam satu sel. Contoh: booking B002 menyimpan kamar '201 ; 202' dalam SATU sel - ini melanggar aturan dasar tabel relasional."</w:t>
-      </w:r>
-    </w:p>
-    <w:p>
-      <w:r>
-        <w:rPr>
-          <w:b w:val="0"/>
-          <w:i w:val="0"/>
-        </w:rPr>
-        <w:t>POIN PENTING: tunjuk simbol penanda repeating group pada tabel di slide.</w:t>
+        <w:t>Nah, dalam aturan database, satu kotak seharusnya hanya boleh berisi SATU nilai. Kondisi di mana satu kotak berisi banyak nilai ini punya istilah, namanya "repeating group" atau kelompok berulang. Inilah tanda paling jelas bahwa data kami belum normal dan harus dirapikan.</w:t>
       </w:r>
     </w:p>
     <w:p>
@@ -1014,9 +629,9 @@
         <w:rPr>
           <w:b/>
           <w:color w:val="B8860B"/>
-          <w:sz w:val="26"/>
+          <w:sz w:val="24"/>
         </w:rPr>
-        <w:t>Slide 5 — Bab 3: Anomali &amp; FD</w:t>
+        <w:t>SLIDE 5 - BAB 3: ANOMALI &amp; FUNCTIONAL DEPENDENCY | sekitar 45 detik | DANIEL</w:t>
       </w:r>
     </w:p>
     <w:p>
@@ -1025,7 +640,7 @@
           <w:b w:val="0"/>
           <w:i w:val="0"/>
         </w:rPr>
-        <w:t>[2:45-3:30 | DANIEL] BAB 3 - ANOMALI &amp; FUNCTIONAL DEPENDENCY</w:t>
+        <w:t>Sebelum mulai merapikan, kami analisis dulu masalahnya secara lebih teliti. Ada tiga anomali - anomali itu artinya kejadian aneh yang merugikan.</w:t>
       </w:r>
     </w:p>
     <w:p>
@@ -1034,7 +649,7 @@
           <w:b w:val="0"/>
           <w:i w:val="0"/>
         </w:rPr>
-        <w:t>"Dari data tersebut kami menemukan 3 anomali klasik, masing-masing dengan contoh nyata dari data kami:</w:t>
+        <w:t>Anomali insert: tipe kamar baru tidak bisa disimpan ke sistem sebelum ada tamu yang memesannya. Anomali update: tamu bernama Andi Wijaya muncul di dua pemesanan, B001 dan B003 - kalau datanya diubah di satu tempat saja, dua catatan itu jadi berbeda. Anomali delete: kalau pemesanan B004 dihapus, layanan "Laundry" ikut hilang dari sistem, karena hanya tercatat di situ.</w:t>
       </w:r>
     </w:p>
     <w:p>
@@ -1043,7 +658,7 @@
           <w:b w:val="0"/>
           <w:i w:val="0"/>
         </w:rPr>
-        <w:t>- INSERTION: tipe kamar baru tidak bisa disimpan sebelum ada yang booking.</w:t>
+        <w:t>Lalu kami juga memetakan yang namanya "functional dependency". Istilah ini terdengar sulit, tapi artinya sederhana: kalau kita tahu nilai A, maka kita pasti tahu nilai B. Contohnya: kalau kita tahu nomor identitas tamu, kita pasti tahu nama, telepon, dan emailnya. Kalau kita tahu nomor kamar, kita pasti tahu kamar itu ada di hotel mana dan tipenya apa.</w:t>
       </w:r>
     </w:p>
     <w:p>
@@ -1052,34 +667,7 @@
           <w:b w:val="0"/>
           <w:i w:val="0"/>
         </w:rPr>
-        <w:t>- UPDATE: Andi Wijaya muncul di B001 dan B003 - ubah satu, yang lain jadi tidak konsisten.</w:t>
-      </w:r>
-    </w:p>
-    <w:p>
-      <w:r>
-        <w:rPr>
-          <w:b w:val="0"/>
-          <w:i w:val="0"/>
-        </w:rPr>
-        <w:t>- DELETION: hapus B004, layanan 'Laundry' ikut hilang selamanya."</w:t>
-      </w:r>
-    </w:p>
-    <w:p>
-      <w:r>
-        <w:rPr>
-          <w:b w:val="0"/>
-          <w:i w:val="0"/>
-        </w:rPr>
-        <w:t>"Kami juga memetakan 6 functional dependency. Yang paling penting: RoomNo menentukan HotelID dan RoomTypeID, lalu RoomTypeID menentukan nama tipe dan harga - ini rantai TRANSITIF yang nanti diselesaikan di 3NF."</w:t>
-      </w:r>
-    </w:p>
-    <w:p>
-      <w:r>
-        <w:rPr>
-          <w:b w:val="0"/>
-          <w:i w:val="0"/>
-        </w:rPr>
-        <w:t>Setelah slide ini, serahkan ke Edvardo untuk bagian normalisasi.</w:t>
+        <w:t>Daftar ketergantungan inilah yang menjadi peta untuk merapikan tabel di langkah berikutnya. Selanjutnya, bagian normalisasi akan dijelaskan oleh Edvardo.</w:t>
       </w:r>
     </w:p>
     <w:p>
@@ -1090,9 +678,9 @@
         <w:rPr>
           <w:b/>
           <w:color w:val="B8860B"/>
-          <w:sz w:val="26"/>
+          <w:sz w:val="24"/>
         </w:rPr>
-        <w:t>Slide 6 — Bab 4: Peta Normalisasi</w:t>
+        <w:t>SLIDE 6 - BAB 4: PETA NORMALISASI | sekitar 30 detik | EDVARDO</w:t>
       </w:r>
     </w:p>
     <w:p>
@@ -1101,7 +689,7 @@
           <w:b w:val="0"/>
           <w:i w:val="0"/>
         </w:rPr>
-        <w:t>[3:30-4:00 | EDVARDO] BAB 4 - PETA NORMALISASI</w:t>
+        <w:t>Terima kasih, Daniel. Sekarang masuk ke solusinya, yaitu NORMALISASI.</w:t>
       </w:r>
     </w:p>
     <w:p>
@@ -1110,7 +698,7 @@
           <w:b w:val="0"/>
           <w:i w:val="0"/>
         </w:rPr>
-        <w:t>"Terima kasih Daniel. Solusinya adalah NORMALISASI: memecah satu tabel besar menjadi tabel-tabel kecil yang terstruktur, tahap demi tahap. Dari UNF (1 tabel) -&gt; 1NF (3 tabel, hilangkan repeating group) -&gt; 2NF (5 tabel, hilangkan partial dependency) -&gt; 3NF (8 tabel, hilangkan transitive dependency)."</w:t>
+        <w:t>Bayangkan normalisasi itu seperti merapikan lemari yang isinya campur aduk. Kita tidak membuang barang apa pun - kita hanya memindahkan setiap barang ke laci yang tepat. Sama persis: normalisasi memecah satu tabel besar menjadi beberapa tabel kecil yang rapi, tanpa mengubah isi datanya.</w:t>
       </w:r>
     </w:p>
     <w:p>
@@ -1119,16 +707,7 @@
           <w:b w:val="0"/>
           <w:i w:val="0"/>
         </w:rPr>
-        <w:t>POIN PENTING: "Setiap tahap TIDAK mengubah isi data - hanya menyusun ulang strukturnya agar lebih aman."</w:t>
-      </w:r>
-    </w:p>
-    <w:p>
-      <w:r>
-        <w:rPr>
-          <w:b w:val="0"/>
-          <w:i w:val="0"/>
-        </w:rPr>
-        <w:t>Slide ini hanya peta - detailnya ada di 3 slide berikut.</w:t>
+        <w:t>Prosesnya tiga tahap. Dari UNF, yaitu satu tabel berantakan. Masuk tahap 1NF, tabelnya jadi tiga. Masuk tahap 2NF, jadi lima tabel. Dan di tahap terakhir, 3NF, hasil akhirnya delapan tabel yang rapi. Sekarang saya jelaskan satu per satu tahapnya.</w:t>
       </w:r>
     </w:p>
     <w:p>
@@ -1139,9 +718,9 @@
         <w:rPr>
           <w:b/>
           <w:color w:val="B8860B"/>
-          <w:sz w:val="26"/>
+          <w:sz w:val="24"/>
         </w:rPr>
-        <w:t>Slide 7 — Langkah 1: 1NF</w:t>
+        <w:t>SLIDE 7 - LANGKAH 1: 1NF | sekitar 40 detik | EDVARDO</w:t>
       </w:r>
     </w:p>
     <w:p>
@@ -1150,7 +729,7 @@
           <w:b w:val="0"/>
           <w:i w:val="0"/>
         </w:rPr>
-        <w:t>[4:00-4:40 | EDVARDO] LANGKAH 1 - 1NF</w:t>
+        <w:t>Tahap pertama: First Normal Form, disingkat 1NF.</w:t>
       </w:r>
     </w:p>
     <w:p>
@@ -1159,7 +738,7 @@
           <w:b w:val="0"/>
           <w:i w:val="0"/>
         </w:rPr>
-        <w:t>"Aturan 1NF: setiap sel hanya boleh berisi SATU nilai (atomik). Sebelumnya, B002 menyimpan dua kamar '201 ; 202' dalam satu sel. Setelah 1NF, setiap nilai mendapat barisnya sendiri: B002-201 dan B002-202."</w:t>
+        <w:t>Aturannya cuma satu dan sederhana: SETIAP KOTAK HANYA BOLEH BERISI SATU NILAI.</w:t>
       </w:r>
     </w:p>
     <w:p>
@@ -1168,7 +747,7 @@
           <w:b w:val="0"/>
           <w:i w:val="0"/>
         </w:rPr>
-        <w:t>"Hasilnya, tabel dipecah menjadi 3 relasi: Booking_1NF, BookingRoom_1NF, dan BookingService_1NF. Primary key gabungan dibentuk dari BookingID + kunci grup berulangnya."</w:t>
+        <w:t>Lihat contoh di kiri, kondisi SEBELUM: pemesanan B002 menyimpan dua nomor kamar, 201 dan 202, di dalam satu kotak. Ini melanggar aturan. Lihat di kanan, kondisi SESUDAH: kami pecah menjadi dua baris - baris pertama B002 dengan kamar 201, baris kedua B002 dengan kamar 202. Sekarang setiap kotak hanya berisi satu nilai.</w:t>
       </w:r>
     </w:p>
     <w:p>
@@ -1177,7 +756,7 @@
           <w:b w:val="0"/>
           <w:i w:val="0"/>
         </w:rPr>
-        <w:t>POIN PENTING: tunjuk perbandingan BEFORE (1 sel berisi 2 nilai) vs AFTER (2 baris atomik).</w:t>
+        <w:t>Setelah semua kotak seperti itu, tabel besar tadi otomatis terbagi menjadi tiga tabel: satu tabel untuk data pemesanannya sendiri, satu tabel untuk daftar kamar yang dipesan, dan satu tabel untuk daftar layanan yang diambil. Selesai tahap satu.</w:t>
       </w:r>
     </w:p>
     <w:p>
@@ -1188,9 +767,9 @@
         <w:rPr>
           <w:b/>
           <w:color w:val="B8860B"/>
-          <w:sz w:val="26"/>
+          <w:sz w:val="24"/>
         </w:rPr>
-        <w:t>Slide 8 — Langkah 2: 2NF</w:t>
+        <w:t>SLIDE 8 - LANGKAH 2: 2NF | sekitar 40 detik | EDVARDO</w:t>
       </w:r>
     </w:p>
     <w:p>
@@ -1199,7 +778,7 @@
           <w:b w:val="0"/>
           <w:i w:val="0"/>
         </w:rPr>
-        <w:t>[4:40-5:20 | EDVARDO] LANGKAH 2 - 2NF</w:t>
+        <w:t>Tahap kedua: Second Normal Form, atau 2NF.</w:t>
       </w:r>
     </w:p>
     <w:p>
@@ -1208,7 +787,7 @@
           <w:b w:val="0"/>
           <w:i w:val="0"/>
         </w:rPr>
-        <w:t>"Aturan 2NF: sudah 1NF, dan setiap atribut non-kunci harus bergantung pada SELURUH primary key, bukan sebagian saja."</w:t>
+        <w:t>Sebelum masuk aturannya, saya jelaskan dulu satu istilah. Setiap tabel punya "primary key", yaitu kolom penanda yang membedakan satu baris dengan baris lain - seperti nomor induk mahasiswa yang membedakan kita satu sama lain. Kadang penandanya harus gabungan DUA kolom sekaligus.</w:t>
       </w:r>
     </w:p>
     <w:p>
@@ -1217,7 +796,7 @@
           <w:b w:val="0"/>
           <w:i w:val="0"/>
         </w:rPr>
-        <w:t>"Masalahnya: di BookingRoom_1NF kuncinya {BookingID, RoomNo}, tetapi RoomTypeID, nama tipe, dan harga hanya bergantung pada RoomNo - ini PARTIAL DEPENDENCY. Hal yang sama terjadi pada layanan yang hanya bergantung pada ServiceID."</w:t>
+        <w:t>Aturan 2NF: setiap kolom biasa harus bergantung pada SELURUH penanda itu, tidak boleh hanya pada separuhnya.</w:t>
       </w:r>
     </w:p>
     <w:p>
@@ -1226,7 +805,16 @@
           <w:b w:val="0"/>
           <w:i w:val="0"/>
         </w:rPr>
-        <w:t>"Solusinya: pindahkan atribut tersebut ke tabel sendiri (Room_2NF dan Service_2NF), sehingga total menjadi 5 relasi. BookingRoom dan BookingService tinggal menjadi tabel penghubung."</w:t>
+        <w:t>Masalah di tabel kami: pada tabel kamar yang dipesan, penandanya gabungan dua kolom, yaitu nomor pemesanan DAN nomor kamar. Tapi tipe kamar dan harganya hanya bergantung pada nomor kamar saja - tidak ada hubungannya dengan nomor pemesanan. Ini disebut "partial dependency", atau ketergantungan sebagian.</w:t>
+      </w:r>
+    </w:p>
+    <w:p>
+      <w:r>
+        <w:rPr>
+          <w:b w:val="0"/>
+          <w:i w:val="0"/>
+        </w:rPr>
+        <w:t>Solusinya: data yang hanya bergantung pada nomor kamar kami pindahkan ke tabel sendiri bernama Room. Data layanan juga sama, pindah ke tabel Service. Hasilnya sekarang lima tabel.</w:t>
       </w:r>
     </w:p>
     <w:p>
@@ -1237,9 +825,9 @@
         <w:rPr>
           <w:b/>
           <w:color w:val="B8860B"/>
-          <w:sz w:val="26"/>
+          <w:sz w:val="24"/>
         </w:rPr>
-        <w:t>Slide 9 — Langkah 3: 3NF</w:t>
+        <w:t>SLIDE 9 - LANGKAH 3: 3NF | sekitar 30 detik | EDVARDO</w:t>
       </w:r>
     </w:p>
     <w:p>
@@ -1248,7 +836,7 @@
           <w:b w:val="0"/>
           <w:i w:val="0"/>
         </w:rPr>
-        <w:t>[5:20-5:50 | EDVARDO] LANGKAH 3 - 3NF</w:t>
+        <w:t>Tahap terakhir: Third Normal Form, atau 3NF.</w:t>
       </w:r>
     </w:p>
     <w:p>
@@ -1257,7 +845,7 @@
           <w:b w:val="0"/>
           <w:i w:val="0"/>
         </w:rPr>
-        <w:t>"Aturan 3NF: sudah 2NF, dan tidak boleh ada atribut non-kunci yang bergantung pada atribut non-kunci lain (TRANSITIVE DEPENDENCY)."</w:t>
+        <w:t>Aturannya: kolom biasa tidak boleh bergantung pada kolom biasa LAINNYA. Ketergantungan yang nyambung lewat perantara seperti ini disebut "transitive dependency".</w:t>
       </w:r>
     </w:p>
     <w:p>
@@ -1266,7 +854,7 @@
           <w:b w:val="0"/>
           <w:i w:val="0"/>
         </w:rPr>
-        <w:t>"Contohnya: BookingID -&gt; GuestID -&gt; nama/telepon/email tamu. Data tamu bergantung pada GuestID, bukan langsung pada BookingID. Maka Guest dipisah jadi tabel sendiri. Hal yang sama untuk Hotel dan RoomType."</w:t>
+        <w:t>Contohnya di tabel kami: dari nomor pemesanan, kita tahu nomor tamunya. Lalu dari nomor tamu, baru kita tahu nama dan teleponnya. Jadi nama tamu itu bergantungnya lewat perantara. Solusinya: data tamu dipisah ke tabel sendiri. Hal yang sama kami lakukan untuk data hotel dan data tipe kamar.</w:t>
       </w:r>
     </w:p>
     <w:p>
@@ -1275,7 +863,7 @@
           <w:b w:val="0"/>
           <w:i w:val="0"/>
         </w:rPr>
-        <w:t>"Hasil akhir: 8 tabel dalam 3NF - 6 tabel entitas (biru) dan 2 tabel junction (emas) yang menyelesaikan relasi many-to-many."</w:t>
+        <w:t>Hasil akhirnya: DELAPAN tabel yang rapi. Enam tabel berwarna biru adalah tabel data utama - Guest untuk tamu, Hotel, RoomType untuk tipe kamar, Room untuk kamar, Service untuk layanan, dan Booking untuk pemesanan. Dua tabel berwarna emas adalah tabel penghubung.</w:t>
       </w:r>
     </w:p>
     <w:p>
@@ -1286,9 +874,9 @@
         <w:rPr>
           <w:b/>
           <w:color w:val="B8860B"/>
-          <w:sz w:val="26"/>
+          <w:sz w:val="24"/>
         </w:rPr>
-        <w:t>Slide 10 — ERD Final</w:t>
+        <w:t>SLIDE 10 - ERD HASIL AKHIR | sekitar 40 detik | EDVARDO</w:t>
       </w:r>
     </w:p>
     <w:p>
@@ -1297,7 +885,7 @@
           <w:b w:val="0"/>
           <w:i w:val="0"/>
         </w:rPr>
-        <w:t>[5:50-6:30 | EDVARDO] ERD HASIL AKHIR</w:t>
+        <w:t>Inilah hasil akhir rancangan kami, digambarkan dalam diagram yang disebut ERD - Entity Relationship Diagram. Sederhananya, ini adalah PETA yang menunjukkan semua tabel dan hubungan antar tabelnya. Garis-garis dengan simbol cakar ayam ini disebut notasi "Crow's Foot" - simbol itu artinya "banyak".</w:t>
       </w:r>
     </w:p>
     <w:p>
@@ -1306,7 +894,7 @@
           <w:b w:val="0"/>
           <w:i w:val="0"/>
         </w:rPr>
-        <w:t>"Inilah ERD final dalam notasi Crow's Foot. Cara membacanya:</w:t>
+        <w:t>Cara membacanya seperti ini:</w:t>
       </w:r>
     </w:p>
     <w:p>
@@ -1315,7 +903,7 @@
           <w:b w:val="0"/>
           <w:i w:val="0"/>
         </w:rPr>
-        <w:t>- Satu GUEST bisa punya banyak BOOKING (1:N).</w:t>
+        <w:t>Satu tamu bisa membuat BANYAK pemesanan, tapi satu pemesanan hanya milik satu tamu.</w:t>
       </w:r>
     </w:p>
     <w:p>
@@ -1324,7 +912,7 @@
           <w:b w:val="0"/>
           <w:i w:val="0"/>
         </w:rPr>
-        <w:t>- Satu HOTEL punya banyak BOOKING dan banyak ROOM (1:N).</w:t>
+        <w:t>Satu hotel bisa menerima banyak pemesanan, dan satu hotel punya banyak kamar.</w:t>
       </w:r>
     </w:p>
     <w:p>
@@ -1333,7 +921,7 @@
           <w:b w:val="0"/>
           <w:i w:val="0"/>
         </w:rPr>
-        <w:t>- Satu ROOMTYPE dipakai banyak ROOM (1:N).</w:t>
+        <w:t>Satu tipe kamar bisa dipakai oleh banyak kamar.</w:t>
       </w:r>
     </w:p>
     <w:p>
@@ -1342,7 +930,7 @@
           <w:b w:val="0"/>
           <w:i w:val="0"/>
         </w:rPr>
-        <w:t>- BOOKING-ROOM dan BOOKING-SERVICE adalah relasi M:N, diselesaikan dengan tabel junction BookingRoom dan BookingService."</w:t>
+        <w:t>Lalu untuk hubungan pemesanan dengan kamar: satu pemesanan bisa berisi beberapa kamar, dan satu kamar bisa dipesan berkali-kali. Hubungan "banyak ke banyak" seperti ini tidak boleh langsung, jadi kami buatkan tabel penghubung bernama BookingRoom. Hal yang sama berlaku untuk layanan, lewat tabel BookingService.</w:t>
       </w:r>
     </w:p>
     <w:p>
@@ -1351,7 +939,7 @@
           <w:b w:val="0"/>
           <w:i w:val="0"/>
         </w:rPr>
-        <w:t>POIN PENTING: sebutkan PK dan FK yang terlihat di setiap entitas. Slide ini menjawab syarat 'Refining an ER Diagram' pada soal.</w:t>
+        <w:t>Di setiap tabel juga terlihat tanda PK untuk primary key, dan FK untuk foreign key - yaitu kolom yang menghubungkan satu tabel ke tabel lain.</w:t>
       </w:r>
     </w:p>
     <w:p>
@@ -1362,9 +950,9 @@
         <w:rPr>
           <w:b/>
           <w:color w:val="B8860B"/>
-          <w:sz w:val="26"/>
+          <w:sz w:val="24"/>
         </w:rPr>
-        <w:t>Slide 11 — Dampak Bisnis</w:t>
+        <w:t>SLIDE 11 - DAMPAK BISNIS | sekitar 20 detik | DANIEL</w:t>
       </w:r>
     </w:p>
     <w:p>
@@ -1373,7 +961,7 @@
           <w:b w:val="0"/>
           <w:i w:val="0"/>
         </w:rPr>
-        <w:t>[6:30-6:50 | DANIEL] DAMPAK BISNIS</w:t>
+        <w:t>Lalu, apa manfaat nyatanya untuk hotel?</w:t>
       </w:r>
     </w:p>
     <w:p>
@@ -1382,7 +970,7 @@
           <w:b w:val="0"/>
           <w:i w:val="0"/>
         </w:rPr>
-        <w:t>"Database yang dinormalisasi bukan hanya rapi secara teknis, tapi manfaatnya nyata: staf front-desk mencari booking lebih cepat dan minim salah ketik; manajemen mendapat laporan okupansi dan pendapatan yang akurat; dan tamu dilayani lebih cepat dengan data pemesanan yang benar."</w:t>
+        <w:t>Untuk staf resepsionis: mencari data pemesanan jadi lebih cepat, dan tidak perlu mengetik ulang data tamu yang sama. Untuk manajemen hotel: laporan tingkat hunian dan pendapatan jadi lebih akurat dan bisa dipercaya. Dan untuk tamunya sendiri: pelayanan lebih cepat dan data pemesanannya selalu benar.</w:t>
       </w:r>
     </w:p>
     <w:p>
@@ -1391,7 +979,7 @@
           <w:b w:val="0"/>
           <w:i w:val="0"/>
         </w:rPr>
-        <w:t>TIPS: cukup 20 detik, pilih satu contoh per kelompok pengguna.</w:t>
+        <w:t>Jadi database yang rapi bukan cuma bagus secara teori - tapi benar-benar membantu pekerjaan sehari-hari.</w:t>
       </w:r>
     </w:p>
     <w:p>
@@ -1402,9 +990,9 @@
         <w:rPr>
           <w:b/>
           <w:color w:val="B8860B"/>
-          <w:sz w:val="26"/>
+          <w:sz w:val="24"/>
         </w:rPr>
-        <w:t>Slide 12 — Before vs After</w:t>
+        <w:t>SLIDE 12 - SEBELUM vs SESUDAH | sekitar 20 detik | DANIEL</w:t>
       </w:r>
     </w:p>
     <w:p>
@@ -1413,7 +1001,7 @@
           <w:b w:val="0"/>
           <w:i w:val="0"/>
         </w:rPr>
-        <w:t>[6:50-7:10 | DANIEL] BEFORE vs AFTER</w:t>
+        <w:t>Ini rangkuman perubahannya, sebelum dan sesudah.</w:t>
       </w:r>
     </w:p>
     <w:p>
@@ -1422,7 +1010,16 @@
           <w:b w:val="0"/>
           <w:i w:val="0"/>
         </w:rPr>
-        <w:t>"Sebagai rangkuman: SEBELUM - satu tabel BookingRecord, data tercampur, nilai berulang, penuh anomali. SESUDAH - 8 tabel 3NF dengan relasi PK/FK, redundansi hilang, query JOIN mudah dan tervalidasi. Data yang disimpan tetap sama - strukturnya yang menjadi lebih aman dan scalable."</w:t>
+        <w:t>SEBELUM: satu tabel besar, semua data tercampur, banyak data ditulis berulang, dan penuh anomali. SESUDAH: delapan tabel yang rapi, setiap data punya tempatnya sendiri, antar tabel saling terhubung dengan kunci, dan datanya mudah dicari.</w:t>
+      </w:r>
+    </w:p>
+    <w:p>
+      <w:r>
+        <w:rPr>
+          <w:b w:val="0"/>
+          <w:i w:val="0"/>
+        </w:rPr>
+        <w:t>Yang penting diingat: isi datanya sama persis, tidak ada yang hilang - hanya susunannya yang dibuat lebih aman dan siap berkembang.</w:t>
       </w:r>
     </w:p>
     <w:p>
@@ -1433,9 +1030,9 @@
         <w:rPr>
           <w:b/>
           <w:color w:val="B8860B"/>
-          <w:sz w:val="26"/>
+          <w:sz w:val="24"/>
         </w:rPr>
-        <w:t>Slide 13 — Bukti MySQL</w:t>
+        <w:t>SLIDE 13 - BUKTI DI MYSQL | sekitar 25 detik | EDVARDO</w:t>
       </w:r>
     </w:p>
     <w:p>
@@ -1444,7 +1041,7 @@
           <w:b w:val="0"/>
           <w:i w:val="0"/>
         </w:rPr>
-        <w:t>[7:10-7:35 | EDVARDO] BUKTI IMPLEMENTASI MYSQL</w:t>
+        <w:t>Rancangan ini tidak berhenti di atas kertas. Kami benar-benar membangunnya di MySQL - yaitu program database yang umum dipakai - dan hasilnya kami kumpulkan dalam file SQL.</w:t>
       </w:r>
     </w:p>
     <w:p>
@@ -1453,7 +1050,7 @@
           <w:b w:val="0"/>
           <w:i w:val="0"/>
         </w:rPr>
-        <w:t>"Desain ini kami implementasikan secara fisik di MySQL (file SejutaStay_Database.sql). Di layar terlihat: perintah CREATE TABLE dengan FOREIGN KEY, query JOIN untuk verifikasi, dan hasil penghitungan baris dari phpMyAdmin: semua 8 tabel terisi, minimal 5 baris per tabel - sesuai ketentuan soal."</w:t>
+        <w:t>Di kiri ini contoh perintah CREATE TABLE untuk membuat tabel kamar, lengkap dengan foreign key yang menghubungkannya ke tabel hotel. Di tengah ada query JOIN, yaitu perintah untuk menggabungkan data dari beberapa tabel sekaligus. Dan di kanan, hasil penghitungan isi tabel: semua tabel terisi minimal lima baris data, sesuai ketentuan soal.</w:t>
       </w:r>
     </w:p>
     <w:p>
@@ -1462,7 +1059,7 @@
           <w:b w:val="0"/>
           <w:i w:val="0"/>
         </w:rPr>
-        <w:t>POIN PENTING: tunjuk screenshot hasil run sebagai BUKTI bahwa script benar-benar dieksekusi tanpa error.</w:t>
+        <w:t>Di bawah ini screenshot dari phpMyAdmin sebagai bukti bahwa perintahnya benar-benar kami jalankan dan berhasil tanpa error.</w:t>
       </w:r>
     </w:p>
     <w:p>
@@ -1473,9 +1070,9 @@
         <w:rPr>
           <w:b/>
           <w:color w:val="B8860B"/>
-          <w:sz w:val="26"/>
+          <w:sz w:val="24"/>
         </w:rPr>
-        <w:t>Slide 14 — Hasil Akhir &amp; Kesimpulan</w:t>
+        <w:t>SLIDE 14 - KESIMPULAN | sekitar 20 detik | EDVARDO</w:t>
       </w:r>
     </w:p>
     <w:p>
@@ -1484,7 +1081,7 @@
           <w:b w:val="0"/>
           <w:i w:val="0"/>
         </w:rPr>
-        <w:t>[7:35-7:55 | EDVARDO] HASIL AKHIR &amp; KESIMPULAN</w:t>
+        <w:t>Kesimpulannya:</w:t>
       </w:r>
     </w:p>
     <w:p>
@@ -1493,7 +1090,16 @@
           <w:b w:val="0"/>
           <w:i w:val="0"/>
         </w:rPr>
-        <w:t>"Kesimpulannya: 8 tabel berhasil dibuat di MySQL, constraint PK/FK diterapkan, minimal 5 baris per tabel terpenuhi, dan query JOIN memverifikasi desain. Redundansi dan ketiga anomali berhasil dihilangkan - SejutaStay kini punya fondasi database yang bersih untuk aplikasi manajemen pemesanan hotel."</w:t>
+        <w:t>Delapan tabel berhasil dibuat di MySQL. Aturan primary key dan foreign key sudah diterapkan. Setiap tabel berisi minimal lima baris data. Dan query JOIN membuktikan semua tabel terhubung dengan benar.</w:t>
+      </w:r>
+    </w:p>
+    <w:p>
+      <w:r>
+        <w:rPr>
+          <w:b w:val="0"/>
+          <w:i w:val="0"/>
+        </w:rPr>
+        <w:t>Dengan kata lain: semua masalah yang kami sebutkan di awal - data dobel, anomali update, insert, dan delete - berhasil dihilangkan. SejutaStay sekarang punya fondasi database yang bersih dan siap dipakai untuk aplikasi pemesanan hotel.</w:t>
       </w:r>
     </w:p>
     <w:p>
@@ -1504,9 +1110,9 @@
         <w:rPr>
           <w:b/>
           <w:color w:val="B8860B"/>
-          <w:sz w:val="26"/>
+          <w:sz w:val="24"/>
         </w:rPr>
-        <w:t>Slide 15 — Penutup &amp; Q&amp;A</w:t>
+        <w:t>SLIDE 15 - PENUTUP | sekitar 10 detik | BERDUA</w:t>
       </w:r>
     </w:p>
     <w:p>
@@ -1515,7 +1121,7 @@
           <w:b w:val="0"/>
           <w:i w:val="0"/>
         </w:rPr>
-        <w:t>[7:55-8:00 | BERDUA] PENUTUP</w:t>
+        <w:t>Sekian presentasi dari kelompok kami. Terima kasih atas perhatian Bapak/Ibu dan teman-teman. Kami siap menjawab pertanyaan.</w:t>
       </w:r>
     </w:p>
     <w:p>
@@ -1524,7 +1130,7 @@
           <w:b w:val="0"/>
           <w:i w:val="0"/>
         </w:rPr>
-        <w:t>"Sekian presentasi dari kelompok kami. Terima kasih atas perhatiannya - kami siap menjawab pertanyaan."</w:t>
+        <w:t>=== CONTEKAN JAWABAN TANYA-JAWAB (bahasa sederhana) ===</w:t>
       </w:r>
     </w:p>
     <w:p>
@@ -1533,7 +1139,7 @@
           <w:b w:val="0"/>
           <w:i w:val="0"/>
         </w:rPr>
-        <w:t>PERSIAPAN Q&amp;A (jawaban singkat):</w:t>
+        <w:t>T: Kenapa berhenti di 3NF, tidak lanjut ke BCNF?</w:t>
       </w:r>
     </w:p>
     <w:p>
@@ -1542,7 +1148,7 @@
           <w:b w:val="0"/>
           <w:i w:val="0"/>
         </w:rPr>
-        <w:t>- "Kenapa berhenti di 3NF, tidak BCNF?" -&gt; Pada desain kami setiap determinan sudah menjadi candidate key, sehingga skema 3NF kami sekaligus memenuhi BCNF; 3NF adalah target yang diminta soal.</w:t>
+        <w:t>J: Soalnya meminta sampai 3NF. Dan kebetulan, desain kami juga sudah memenuhi syarat BCNF, karena di setiap tabel, semua yang "menentukan" kolom lain memang sudah menjadi kunci tabel itu.</w:t>
       </w:r>
     </w:p>
     <w:p>
@@ -1551,7 +1157,7 @@
           <w:b w:val="0"/>
           <w:i w:val="0"/>
         </w:rPr>
-        <w:t>- "Kenapa RoomNo jadi PK Room?" -&gt; Kami asumsikan RoomNo unik se-jaringan; HotelID tetap disimpan sebagai FK agar tiap kamar terikat ke cabangnya.</w:t>
+        <w:t>T: Kenapa nomor kamar (RoomNo) dijadikan primary key tabel Room?</w:t>
       </w:r>
     </w:p>
     <w:p>
@@ -1560,60 +1166,43 @@
           <w:b w:val="0"/>
           <w:i w:val="0"/>
         </w:rPr>
-        <w:t>- "Kenapa perlu tabel junction?" -&gt; Karena relasi Booking-Room dan Booking-Service bersifat many-to-many, yang tidak bisa diwakili langsung oleh satu FK.</w:t>
+        <w:t>J: Kami pakai asumsi bahwa nomor kamar bersifat unik di seluruh jaringan hotel - tidak ada dua kamar dengan nomor sama. Kolom HotelID tetap kami simpan di tabel Room supaya setiap kamar jelas milik cabang yang mana.</w:t>
       </w:r>
     </w:p>
     <w:p>
-      <w:pPr>
-        <w:spacing w:before="280"/>
-      </w:pPr>
       <w:r>
         <w:rPr>
-          <w:b/>
-          <w:color w:val="0E4A5C"/>
-          <w:sz w:val="32"/>
+          <w:b w:val="0"/>
+          <w:i w:val="0"/>
         </w:rPr>
-        <w:t>Tips Presentasi 8 Menit</w:t>
+        <w:t>T: Kenapa harus ada tabel penghubung BookingRoom dan BookingService?</w:t>
       </w:r>
     </w:p>
     <w:p>
-      <w:pPr>
-        <w:pStyle w:val="ListBullet"/>
-      </w:pPr>
       <w:r>
-        <w:t>Latihan dengan timer minimal 2 kali; target selesai di menit 7:30 agar ada cadangan waktu.</w:t>
+        <w:rPr>
+          <w:b w:val="0"/>
+          <w:i w:val="0"/>
+        </w:rPr>
+        <w:t>J: Karena hubungannya "banyak ke banyak": satu pemesanan bisa berisi banyak kamar, dan satu kamar bisa muncul di banyak pemesanan. Hubungan seperti ini tidak bisa digambarkan dengan satu kolom saja, jadi butuh tabel kecil di tengah sebagai jembatan.</w:t>
       </w:r>
     </w:p>
     <w:p>
-      <w:pPr>
-        <w:pStyle w:val="ListBullet"/>
-      </w:pPr>
       <w:r>
-        <w:t>Jangan membaca slide — slide hanya berisi kata kunci, penjelasan lengkap ada di naskah ini.</w:t>
+        <w:rPr>
+          <w:b w:val="0"/>
+          <w:i w:val="0"/>
+        </w:rPr>
+        <w:t>T: Apa bedanya primary key dan foreign key?</w:t>
       </w:r>
     </w:p>
     <w:p>
-      <w:pPr>
-        <w:pStyle w:val="ListBullet"/>
-      </w:pPr>
       <w:r>
-        <w:t>Bagian paling penting untuk nilai: 5 masalah (Bab 1), langkah normalisasi (Bab 4), ERD, dan bukti MySQL — jangan sampai terpotong.</w:t>
-      </w:r>
-    </w:p>
-    <w:p>
-      <w:pPr>
-        <w:pStyle w:val="ListBullet"/>
-      </w:pPr>
-      <w:r>
-        <w:t>Saat menjelaskan 1NF/2NF/3NF, selalu sebutkan polanya: ATURAN → MASALAH → SOLUSI.</w:t>
-      </w:r>
-    </w:p>
-    <w:p>
-      <w:pPr>
-        <w:pStyle w:val="ListBullet"/>
-      </w:pPr>
-      <w:r>
-        <w:t>Siapkan jawaban Q&amp;A yang sudah ditulis di catatan slide 15.</w:t>
+        <w:rPr>
+          <w:b w:val="0"/>
+          <w:i w:val="0"/>
+        </w:rPr>
+        <w:t>J: Primary key itu penanda unik milik tabel sendiri, seperti NIM mahasiswa. Foreign key itu "salinan" penanda dari tabel lain, yang gunanya menghubungkan dua tabel.</w:t>
       </w:r>
     </w:p>
     <w:sectPr>

</xml_diff>